<commit_message>
Weekly internship search: 2026-10-17 (docx regen checkpoint)
Co-Authored-By: Claude Sonnet 5 <noreply@anthropic.com>
Claude-Session: https://claude.ai/code/session_01AEjiapuS5ShbSSqPGjKtvg
</commit_message>
<xml_diff>
--- a/resumes/database.docx
+++ b/resumes/database.docx
@@ -4,7 +4,7 @@
   <w:body>
     <w:p>
       <w:pPr>
-        <w:spacing w:after="40"/>
+        <w:spacing w:after="40" w:before="0"/>
         <w:jc w:val="center"/>
       </w:pPr>
       <w:r>
@@ -23,12 +23,14 @@
         <w:pBdr>
           <w:bottom w:val="single" w:color="000000" w:sz="6" w:space="6"/>
         </w:pBdr>
-        <w:spacing w:after="100"/>
+        <w:spacing w:after="100" w:before="0"/>
         <w:jc w:val="center"/>
       </w:pPr>
       <w:r>
         <w:rPr>
           <w:rFonts w:ascii="Times New Roman" w:cs="Times New Roman" w:eastAsia="Times New Roman" w:hAnsi="Times New Roman"/>
+          <w:b w:val="false"/>
+          <w:bCs w:val="false"/>
           <w:sz w:val="18"/>
           <w:szCs w:val="18"/>
         </w:rPr>
@@ -37,9 +39,6 @@
     </w:p>
     <w:p>
       <w:pPr>
-        <w:pBdr>
-          <w:bottom w:val="none"/>
-        </w:pBdr>
         <w:spacing w:after="60" w:before="180"/>
       </w:pPr>
       <w:r>
@@ -47,7 +46,6 @@
           <w:rFonts w:ascii="Times New Roman" w:cs="Times New Roman" w:eastAsia="Times New Roman" w:hAnsi="Times New Roman"/>
           <w:b/>
           <w:bCs/>
-          <w:caps/>
           <w:sz w:val="21"/>
           <w:szCs w:val="21"/>
           <w:u w:val="single"/>
@@ -57,7 +55,7 @@
     </w:p>
     <w:p>
       <w:pPr>
-        <w:spacing w:after="20"/>
+        <w:spacing w:after="20" w:before="0"/>
       </w:pPr>
       <w:r>
         <w:rPr>
@@ -72,6 +70,8 @@
       <w:r>
         <w:rPr>
           <w:rFonts w:ascii="Times New Roman" w:cs="Times New Roman" w:eastAsia="Times New Roman" w:hAnsi="Times New Roman"/>
+          <w:b w:val="false"/>
+          <w:bCs w:val="false"/>
           <w:sz w:val="21"/>
           <w:szCs w:val="21"/>
         </w:rPr>
@@ -90,12 +90,14 @@
     </w:p>
     <w:p>
       <w:pPr>
-        <w:spacing w:after="20"/>
-        <w:ind w:left="270" w:hanging="180"/>
-      </w:pPr>
-      <w:r>
-        <w:rPr>
-          <w:rFonts w:ascii="Times New Roman" w:cs="Times New Roman" w:eastAsia="Times New Roman" w:hAnsi="Times New Roman"/>
+        <w:spacing w:after="20" w:before="0"/>
+        <w:ind w:left="270"/>
+      </w:pPr>
+      <w:r>
+        <w:rPr>
+          <w:rFonts w:ascii="Times New Roman" w:cs="Times New Roman" w:eastAsia="Times New Roman" w:hAnsi="Times New Roman"/>
+          <w:b w:val="false"/>
+          <w:bCs w:val="false"/>
           <w:sz w:val="21"/>
           <w:szCs w:val="21"/>
         </w:rPr>
@@ -104,30 +106,24 @@
       <w:r>
         <w:rPr>
           <w:rFonts w:ascii="Times New Roman" w:cs="Times New Roman" w:eastAsia="Times New Roman" w:hAnsi="Times New Roman"/>
-          <w:b/>
-          <w:bCs/>
-          <w:sz w:val="21"/>
-          <w:szCs w:val="21"/>
-        </w:rPr>
-        <w:t xml:space="preserve">GPA: </w:t>
-      </w:r>
-      <w:r>
-        <w:rPr>
-          <w:rFonts w:ascii="Times New Roman" w:cs="Times New Roman" w:eastAsia="Times New Roman" w:hAnsi="Times New Roman"/>
-          <w:sz w:val="21"/>
-          <w:szCs w:val="21"/>
-        </w:rPr>
-        <w:t xml:space="preserve">3.578</w:t>
-      </w:r>
-    </w:p>
-    <w:p>
-      <w:pPr>
-        <w:spacing w:after="20"/>
-        <w:ind w:left="270" w:hanging="180"/>
-      </w:pPr>
-      <w:r>
-        <w:rPr>
-          <w:rFonts w:ascii="Times New Roman" w:cs="Times New Roman" w:eastAsia="Times New Roman" w:hAnsi="Times New Roman"/>
+          <w:b w:val="false"/>
+          <w:bCs w:val="false"/>
+          <w:sz w:val="21"/>
+          <w:szCs w:val="21"/>
+        </w:rPr>
+        <w:t xml:space="preserve">GPA: 3.578</w:t>
+      </w:r>
+    </w:p>
+    <w:p>
+      <w:pPr>
+        <w:spacing w:after="20" w:before="0"/>
+        <w:ind w:left="270"/>
+      </w:pPr>
+      <w:r>
+        <w:rPr>
+          <w:rFonts w:ascii="Times New Roman" w:cs="Times New Roman" w:eastAsia="Times New Roman" w:hAnsi="Times New Roman"/>
+          <w:b w:val="false"/>
+          <w:bCs w:val="false"/>
           <w:sz w:val="21"/>
           <w:szCs w:val="21"/>
         </w:rPr>
@@ -136,27 +132,16 @@
       <w:r>
         <w:rPr>
           <w:rFonts w:ascii="Times New Roman" w:cs="Times New Roman" w:eastAsia="Times New Roman" w:hAnsi="Times New Roman"/>
-          <w:b/>
-          <w:bCs/>
-          <w:sz w:val="21"/>
-          <w:szCs w:val="21"/>
-        </w:rPr>
-        <w:t xml:space="preserve">Relevant Coursework: </w:t>
-      </w:r>
-      <w:r>
-        <w:rPr>
-          <w:rFonts w:ascii="Times New Roman" w:cs="Times New Roman" w:eastAsia="Times New Roman" w:hAnsi="Times New Roman"/>
-          <w:sz w:val="21"/>
-          <w:szCs w:val="21"/>
-        </w:rPr>
-        <w:t xml:space="preserve">Design and Analysis of Database Systems, Computer Algorithms, Software Development: Full Stack</w:t>
-      </w:r>
-    </w:p>
-    <w:p>
-      <w:pPr>
-        <w:pBdr>
-          <w:bottom w:val="none"/>
-        </w:pBdr>
+          <w:b w:val="false"/>
+          <w:bCs w:val="false"/>
+          <w:sz w:val="21"/>
+          <w:szCs w:val="21"/>
+        </w:rPr>
+        <w:t xml:space="preserve">Relevant Coursework: Design and Analysis of Database Systems, Computer Algorithms, Software Development: Full Stack</w:t>
+      </w:r>
+    </w:p>
+    <w:p>
+      <w:pPr>
         <w:spacing w:after="60" w:before="180"/>
       </w:pPr>
       <w:r>
@@ -164,7 +149,6 @@
           <w:rFonts w:ascii="Times New Roman" w:cs="Times New Roman" w:eastAsia="Times New Roman" w:hAnsi="Times New Roman"/>
           <w:b/>
           <w:bCs/>
-          <w:caps/>
           <w:sz w:val="21"/>
           <w:szCs w:val="21"/>
           <w:u w:val="single"/>
@@ -174,78 +158,81 @@
     </w:p>
     <w:p>
       <w:pPr>
-        <w:spacing w:after="20"/>
-      </w:pPr>
-      <w:r>
-        <w:rPr>
-          <w:rFonts w:ascii="Times New Roman" w:cs="Times New Roman" w:eastAsia="Times New Roman" w:hAnsi="Times New Roman"/>
-          <w:b/>
-          <w:bCs/>
-          <w:sz w:val="21"/>
-          <w:szCs w:val="21"/>
-        </w:rPr>
-        <w:t xml:space="preserve">Languages: </w:t>
-      </w:r>
-      <w:r>
-        <w:rPr>
-          <w:rFonts w:ascii="Times New Roman" w:cs="Times New Roman" w:eastAsia="Times New Roman" w:hAnsi="Times New Roman"/>
-          <w:sz w:val="21"/>
-          <w:szCs w:val="21"/>
-        </w:rPr>
-        <w:t xml:space="preserve">SQL, Python, R-Studio, C++, JavaScript, Node.js, C, HTML, Arduino</w:t>
-      </w:r>
-    </w:p>
-    <w:p>
-      <w:pPr>
-        <w:spacing w:after="20"/>
-      </w:pPr>
-      <w:r>
-        <w:rPr>
-          <w:rFonts w:ascii="Times New Roman" w:cs="Times New Roman" w:eastAsia="Times New Roman" w:hAnsi="Times New Roman"/>
-          <w:b/>
-          <w:bCs/>
-          <w:sz w:val="21"/>
-          <w:szCs w:val="21"/>
-        </w:rPr>
-        <w:t xml:space="preserve">Tools: </w:t>
-      </w:r>
-      <w:r>
-        <w:rPr>
-          <w:rFonts w:ascii="Times New Roman" w:cs="Times New Roman" w:eastAsia="Times New Roman" w:hAnsi="Times New Roman"/>
-          <w:sz w:val="21"/>
-          <w:szCs w:val="21"/>
-        </w:rPr>
-        <w:t xml:space="preserve">Microsoft Excel, Postman, Docker, Azure DevOps, Salesforce, MacOS, Windows OS, Google Suite</w:t>
-      </w:r>
-    </w:p>
-    <w:p>
-      <w:pPr>
-        <w:spacing w:after="20"/>
-      </w:pPr>
-      <w:r>
-        <w:rPr>
-          <w:rFonts w:ascii="Times New Roman" w:cs="Times New Roman" w:eastAsia="Times New Roman" w:hAnsi="Times New Roman"/>
-          <w:b/>
-          <w:bCs/>
-          <w:sz w:val="21"/>
-          <w:szCs w:val="21"/>
-        </w:rPr>
-        <w:t xml:space="preserve">Other Skills: </w:t>
-      </w:r>
-      <w:r>
-        <w:rPr>
-          <w:rFonts w:ascii="Times New Roman" w:cs="Times New Roman" w:eastAsia="Times New Roman" w:hAnsi="Times New Roman"/>
-          <w:sz w:val="21"/>
-          <w:szCs w:val="21"/>
-        </w:rPr>
-        <w:t xml:space="preserve">Data Analysis, Statistical Analysis, Analytical Problem Solving, AI Prompt Engineering</w:t>
-      </w:r>
-    </w:p>
-    <w:p>
-      <w:pPr>
-        <w:pBdr>
-          <w:bottom w:val="none"/>
-        </w:pBdr>
+        <w:spacing w:after="40" w:before="0"/>
+      </w:pPr>
+      <w:r>
+        <w:rPr>
+          <w:rFonts w:ascii="Times New Roman" w:cs="Times New Roman" w:eastAsia="Times New Roman" w:hAnsi="Times New Roman"/>
+          <w:b/>
+          <w:bCs/>
+          <w:sz w:val="21"/>
+          <w:szCs w:val="21"/>
+        </w:rPr>
+        <w:t xml:space="preserve">Languages:</w:t>
+      </w:r>
+      <w:r>
+        <w:rPr>
+          <w:rFonts w:ascii="Times New Roman" w:cs="Times New Roman" w:eastAsia="Times New Roman" w:hAnsi="Times New Roman"/>
+          <w:b w:val="false"/>
+          <w:bCs w:val="false"/>
+          <w:sz w:val="21"/>
+          <w:szCs w:val="21"/>
+        </w:rPr>
+        <w:t xml:space="preserve"> SQL, Python, R-Studio, C++, JavaScript, Node.js, C, HTML, Arduino</w:t>
+      </w:r>
+    </w:p>
+    <w:p>
+      <w:pPr>
+        <w:spacing w:after="40" w:before="0"/>
+      </w:pPr>
+      <w:r>
+        <w:rPr>
+          <w:rFonts w:ascii="Times New Roman" w:cs="Times New Roman" w:eastAsia="Times New Roman" w:hAnsi="Times New Roman"/>
+          <w:b/>
+          <w:bCs/>
+          <w:sz w:val="21"/>
+          <w:szCs w:val="21"/>
+        </w:rPr>
+        <w:t xml:space="preserve">Tools:</w:t>
+      </w:r>
+      <w:r>
+        <w:rPr>
+          <w:rFonts w:ascii="Times New Roman" w:cs="Times New Roman" w:eastAsia="Times New Roman" w:hAnsi="Times New Roman"/>
+          <w:b w:val="false"/>
+          <w:bCs w:val="false"/>
+          <w:sz w:val="21"/>
+          <w:szCs w:val="21"/>
+        </w:rPr>
+        <w:t xml:space="preserve"> Microsoft Excel, Postman, Docker, Azure DevOps, Salesforce, MacOS, Windows OS, Google Suite</w:t>
+      </w:r>
+    </w:p>
+    <w:p>
+      <w:pPr>
+        <w:spacing w:after="40" w:before="0"/>
+      </w:pPr>
+      <w:r>
+        <w:rPr>
+          <w:rFonts w:ascii="Times New Roman" w:cs="Times New Roman" w:eastAsia="Times New Roman" w:hAnsi="Times New Roman"/>
+          <w:b/>
+          <w:bCs/>
+          <w:sz w:val="21"/>
+          <w:szCs w:val="21"/>
+        </w:rPr>
+        <w:t xml:space="preserve">Other:</w:t>
+      </w:r>
+      <w:r>
+        <w:rPr>
+          <w:rFonts w:ascii="Times New Roman" w:cs="Times New Roman" w:eastAsia="Times New Roman" w:hAnsi="Times New Roman"/>
+          <w:b w:val="false"/>
+          <w:bCs w:val="false"/>
+          <w:sz w:val="21"/>
+          <w:szCs w:val="21"/>
+        </w:rPr>
+        <w:t xml:space="preserve"> Data Analysis, Statistical Analysis, Analytical Problem Solving, AI Prompt Engineering</w:t>
+      </w:r>
+    </w:p>
+    <w:p>
+      <w:pPr>
         <w:spacing w:after="60" w:before="180"/>
       </w:pPr>
       <w:r>
@@ -253,7 +240,6 @@
           <w:rFonts w:ascii="Times New Roman" w:cs="Times New Roman" w:eastAsia="Times New Roman" w:hAnsi="Times New Roman"/>
           <w:b/>
           <w:bCs/>
-          <w:caps/>
           <w:sz w:val="21"/>
           <w:szCs w:val="21"/>
           <w:u w:val="single"/>
@@ -263,7 +249,7 @@
     </w:p>
     <w:p>
       <w:pPr>
-        <w:spacing w:after="60"/>
+        <w:spacing w:after="60" w:before="0"/>
       </w:pPr>
       <w:r>
         <w:rPr>
@@ -278,6 +264,8 @@
       <w:r>
         <w:rPr>
           <w:rFonts w:ascii="Times New Roman" w:cs="Times New Roman" w:eastAsia="Times New Roman" w:hAnsi="Times New Roman"/>
+          <w:b w:val="false"/>
+          <w:bCs w:val="false"/>
           <w:sz w:val="21"/>
           <w:szCs w:val="21"/>
         </w:rPr>
@@ -286,15 +274,17 @@
       <w:r>
         <w:rPr>
           <w:rFonts w:ascii="Times New Roman" w:cs="Times New Roman" w:eastAsia="Times New Roman" w:hAnsi="Times New Roman"/>
-          <w:sz w:val="21"/>
-          <w:szCs w:val="21"/>
-        </w:rPr>
-        <w:t xml:space="preserve">Designing and documenting the schema and query requirements for a database-oriented reporting tool allowing users to selectively query statistics from individual games, players, and teams. Automates away the need for users to manually acquire data by leveraging SQL techniques to select, filter, engineer, analyze, administer, and maintain stats across a relational database. Built with Python and SQL.</w:t>
-      </w:r>
-    </w:p>
-    <w:p>
-      <w:pPr>
-        <w:spacing w:after="60"/>
+          <w:b w:val="false"/>
+          <w:bCs w:val="false"/>
+          <w:sz w:val="21"/>
+          <w:szCs w:val="21"/>
+        </w:rPr>
+        <w:t xml:space="preserve">Designing and documenting the schema and query requirements for a database-oriented reporting tool allowing users to selectively query statistics from individual games, players, and teams. Automates away the need for users to manually acquire data by leveraging SQL techniques and data-pipeline design to select, filter, engineer, analyze, administer, and maintain stats across a relational database. Built with Python and SQL.</w:t>
+      </w:r>
+    </w:p>
+    <w:p>
+      <w:pPr>
+        <w:spacing w:after="60" w:before="0"/>
       </w:pPr>
       <w:r>
         <w:rPr>
@@ -309,6 +299,8 @@
       <w:r>
         <w:rPr>
           <w:rFonts w:ascii="Times New Roman" w:cs="Times New Roman" w:eastAsia="Times New Roman" w:hAnsi="Times New Roman"/>
+          <w:b w:val="false"/>
+          <w:bCs w:val="false"/>
           <w:sz w:val="21"/>
           <w:szCs w:val="21"/>
         </w:rPr>
@@ -317,6 +309,8 @@
       <w:r>
         <w:rPr>
           <w:rFonts w:ascii="Times New Roman" w:cs="Times New Roman" w:eastAsia="Times New Roman" w:hAnsi="Times New Roman"/>
+          <w:b w:val="false"/>
+          <w:bCs w:val="false"/>
           <w:sz w:val="21"/>
           <w:szCs w:val="21"/>
         </w:rPr>
@@ -325,7 +319,7 @@
     </w:p>
     <w:p>
       <w:pPr>
-        <w:spacing w:after="60"/>
+        <w:spacing w:after="60" w:before="0"/>
       </w:pPr>
       <w:r>
         <w:rPr>
@@ -340,6 +334,8 @@
       <w:r>
         <w:rPr>
           <w:rFonts w:ascii="Times New Roman" w:cs="Times New Roman" w:eastAsia="Times New Roman" w:hAnsi="Times New Roman"/>
+          <w:b w:val="false"/>
+          <w:bCs w:val="false"/>
           <w:sz w:val="21"/>
           <w:szCs w:val="21"/>
         </w:rPr>
@@ -348,6 +344,8 @@
       <w:r>
         <w:rPr>
           <w:rFonts w:ascii="Times New Roman" w:cs="Times New Roman" w:eastAsia="Times New Roman" w:hAnsi="Times New Roman"/>
+          <w:b w:val="false"/>
+          <w:bCs w:val="false"/>
           <w:sz w:val="21"/>
           <w:szCs w:val="21"/>
         </w:rPr>
@@ -356,9 +354,6 @@
     </w:p>
     <w:p>
       <w:pPr>
-        <w:pBdr>
-          <w:bottom w:val="none"/>
-        </w:pBdr>
         <w:spacing w:after="60" w:before="180"/>
       </w:pPr>
       <w:r>
@@ -366,7 +361,6 @@
           <w:rFonts w:ascii="Times New Roman" w:cs="Times New Roman" w:eastAsia="Times New Roman" w:hAnsi="Times New Roman"/>
           <w:b/>
           <w:bCs/>
-          <w:caps/>
           <w:sz w:val="21"/>
           <w:szCs w:val="21"/>
           <w:u w:val="single"/>
@@ -379,7 +373,7 @@
         <w:tabs>
           <w:tab w:val="right" w:pos="9026"/>
         </w:tabs>
-        <w:spacing w:after="0"/>
+        <w:spacing w:after="0" w:before="0"/>
       </w:pPr>
       <w:r>
         <w:rPr>
@@ -394,6 +388,8 @@
       <w:r>
         <w:rPr>
           <w:rFonts w:ascii="Times New Roman" w:cs="Times New Roman" w:eastAsia="Times New Roman" w:hAnsi="Times New Roman"/>
+          <w:b w:val="false"/>
+          <w:bCs w:val="false"/>
           <w:sz w:val="21"/>
           <w:szCs w:val="21"/>
         </w:rPr>
@@ -402,11 +398,13 @@
     </w:p>
     <w:p>
       <w:pPr>
-        <w:spacing w:after="40"/>
-      </w:pPr>
-      <w:r>
-        <w:rPr>
-          <w:rFonts w:ascii="Times New Roman" w:cs="Times New Roman" w:eastAsia="Times New Roman" w:hAnsi="Times New Roman"/>
+        <w:spacing w:after="40" w:before="0"/>
+      </w:pPr>
+      <w:r>
+        <w:rPr>
+          <w:rFonts w:ascii="Times New Roman" w:cs="Times New Roman" w:eastAsia="Times New Roman" w:hAnsi="Times New Roman"/>
+          <w:b w:val="false"/>
+          <w:bCs w:val="false"/>
           <w:sz w:val="21"/>
           <w:szCs w:val="21"/>
         </w:rPr>
@@ -415,12 +413,14 @@
     </w:p>
     <w:p>
       <w:pPr>
-        <w:spacing w:after="20"/>
-        <w:ind w:left="270" w:hanging="180"/>
-      </w:pPr>
-      <w:r>
-        <w:rPr>
-          <w:rFonts w:ascii="Times New Roman" w:cs="Times New Roman" w:eastAsia="Times New Roman" w:hAnsi="Times New Roman"/>
+        <w:spacing w:after="20" w:before="0"/>
+        <w:ind w:left="270"/>
+      </w:pPr>
+      <w:r>
+        <w:rPr>
+          <w:rFonts w:ascii="Times New Roman" w:cs="Times New Roman" w:eastAsia="Times New Roman" w:hAnsi="Times New Roman"/>
+          <w:b w:val="false"/>
+          <w:bCs w:val="false"/>
           <w:sz w:val="21"/>
           <w:szCs w:val="21"/>
         </w:rPr>
@@ -429,6 +429,8 @@
       <w:r>
         <w:rPr>
           <w:rFonts w:ascii="Times New Roman" w:cs="Times New Roman" w:eastAsia="Times New Roman" w:hAnsi="Times New Roman"/>
+          <w:b w:val="false"/>
+          <w:bCs w:val="false"/>
           <w:sz w:val="21"/>
           <w:szCs w:val="21"/>
         </w:rPr>
@@ -437,12 +439,14 @@
     </w:p>
     <w:p>
       <w:pPr>
-        <w:spacing w:after="20"/>
-        <w:ind w:left="270" w:hanging="180"/>
-      </w:pPr>
-      <w:r>
-        <w:rPr>
-          <w:rFonts w:ascii="Times New Roman" w:cs="Times New Roman" w:eastAsia="Times New Roman" w:hAnsi="Times New Roman"/>
+        <w:spacing w:after="20" w:before="0"/>
+        <w:ind w:left="270"/>
+      </w:pPr>
+      <w:r>
+        <w:rPr>
+          <w:rFonts w:ascii="Times New Roman" w:cs="Times New Roman" w:eastAsia="Times New Roman" w:hAnsi="Times New Roman"/>
+          <w:b w:val="false"/>
+          <w:bCs w:val="false"/>
           <w:sz w:val="21"/>
           <w:szCs w:val="21"/>
         </w:rPr>
@@ -451,6 +455,8 @@
       <w:r>
         <w:rPr>
           <w:rFonts w:ascii="Times New Roman" w:cs="Times New Roman" w:eastAsia="Times New Roman" w:hAnsi="Times New Roman"/>
+          <w:b w:val="false"/>
+          <w:bCs w:val="false"/>
           <w:sz w:val="21"/>
           <w:szCs w:val="21"/>
         </w:rPr>
@@ -459,12 +465,14 @@
     </w:p>
     <w:p>
       <w:pPr>
-        <w:spacing w:after="20"/>
-        <w:ind w:left="270" w:hanging="180"/>
-      </w:pPr>
-      <w:r>
-        <w:rPr>
-          <w:rFonts w:ascii="Times New Roman" w:cs="Times New Roman" w:eastAsia="Times New Roman" w:hAnsi="Times New Roman"/>
+        <w:spacing w:after="20" w:before="0"/>
+        <w:ind w:left="270"/>
+      </w:pPr>
+      <w:r>
+        <w:rPr>
+          <w:rFonts w:ascii="Times New Roman" w:cs="Times New Roman" w:eastAsia="Times New Roman" w:hAnsi="Times New Roman"/>
+          <w:b w:val="false"/>
+          <w:bCs w:val="false"/>
           <w:sz w:val="21"/>
           <w:szCs w:val="21"/>
         </w:rPr>
@@ -473,6 +481,8 @@
       <w:r>
         <w:rPr>
           <w:rFonts w:ascii="Times New Roman" w:cs="Times New Roman" w:eastAsia="Times New Roman" w:hAnsi="Times New Roman"/>
+          <w:b w:val="false"/>
+          <w:bCs w:val="false"/>
           <w:sz w:val="21"/>
           <w:szCs w:val="21"/>
         </w:rPr>
@@ -484,7 +494,7 @@
         <w:tabs>
           <w:tab w:val="right" w:pos="9026"/>
         </w:tabs>
-        <w:spacing w:after="0"/>
+        <w:spacing w:after="0" w:before="0"/>
       </w:pPr>
       <w:r>
         <w:rPr>
@@ -499,6 +509,8 @@
       <w:r>
         <w:rPr>
           <w:rFonts w:ascii="Times New Roman" w:cs="Times New Roman" w:eastAsia="Times New Roman" w:hAnsi="Times New Roman"/>
+          <w:b w:val="false"/>
+          <w:bCs w:val="false"/>
           <w:sz w:val="21"/>
           <w:szCs w:val="21"/>
         </w:rPr>
@@ -507,11 +519,13 @@
     </w:p>
     <w:p>
       <w:pPr>
-        <w:spacing w:after="40"/>
-      </w:pPr>
-      <w:r>
-        <w:rPr>
-          <w:rFonts w:ascii="Times New Roman" w:cs="Times New Roman" w:eastAsia="Times New Roman" w:hAnsi="Times New Roman"/>
+        <w:spacing w:after="40" w:before="0"/>
+      </w:pPr>
+      <w:r>
+        <w:rPr>
+          <w:rFonts w:ascii="Times New Roman" w:cs="Times New Roman" w:eastAsia="Times New Roman" w:hAnsi="Times New Roman"/>
+          <w:b w:val="false"/>
+          <w:bCs w:val="false"/>
           <w:sz w:val="21"/>
           <w:szCs w:val="21"/>
         </w:rPr>
@@ -520,12 +534,14 @@
     </w:p>
     <w:p>
       <w:pPr>
-        <w:spacing w:after="20"/>
-        <w:ind w:left="270" w:hanging="180"/>
-      </w:pPr>
-      <w:r>
-        <w:rPr>
-          <w:rFonts w:ascii="Times New Roman" w:cs="Times New Roman" w:eastAsia="Times New Roman" w:hAnsi="Times New Roman"/>
+        <w:spacing w:after="20" w:before="0"/>
+        <w:ind w:left="270"/>
+      </w:pPr>
+      <w:r>
+        <w:rPr>
+          <w:rFonts w:ascii="Times New Roman" w:cs="Times New Roman" w:eastAsia="Times New Roman" w:hAnsi="Times New Roman"/>
+          <w:b w:val="false"/>
+          <w:bCs w:val="false"/>
           <w:sz w:val="21"/>
           <w:szCs w:val="21"/>
         </w:rPr>
@@ -534,6 +550,8 @@
       <w:r>
         <w:rPr>
           <w:rFonts w:ascii="Times New Roman" w:cs="Times New Roman" w:eastAsia="Times New Roman" w:hAnsi="Times New Roman"/>
+          <w:b w:val="false"/>
+          <w:bCs w:val="false"/>
           <w:sz w:val="21"/>
           <w:szCs w:val="21"/>
         </w:rPr>
@@ -542,12 +560,14 @@
     </w:p>
     <w:p>
       <w:pPr>
-        <w:spacing w:after="20"/>
-        <w:ind w:left="270" w:hanging="180"/>
-      </w:pPr>
-      <w:r>
-        <w:rPr>
-          <w:rFonts w:ascii="Times New Roman" w:cs="Times New Roman" w:eastAsia="Times New Roman" w:hAnsi="Times New Roman"/>
+        <w:spacing w:after="20" w:before="0"/>
+        <w:ind w:left="270"/>
+      </w:pPr>
+      <w:r>
+        <w:rPr>
+          <w:rFonts w:ascii="Times New Roman" w:cs="Times New Roman" w:eastAsia="Times New Roman" w:hAnsi="Times New Roman"/>
+          <w:b w:val="false"/>
+          <w:bCs w:val="false"/>
           <w:sz w:val="21"/>
           <w:szCs w:val="21"/>
         </w:rPr>
@@ -556,6 +576,8 @@
       <w:r>
         <w:rPr>
           <w:rFonts w:ascii="Times New Roman" w:cs="Times New Roman" w:eastAsia="Times New Roman" w:hAnsi="Times New Roman"/>
+          <w:b w:val="false"/>
+          <w:bCs w:val="false"/>
           <w:sz w:val="21"/>
           <w:szCs w:val="21"/>
         </w:rPr>
@@ -564,9 +586,6 @@
     </w:p>
     <w:p>
       <w:pPr>
-        <w:pBdr>
-          <w:bottom w:val="none"/>
-        </w:pBdr>
         <w:spacing w:after="60" w:before="180"/>
       </w:pPr>
       <w:r>
@@ -574,7 +593,6 @@
           <w:rFonts w:ascii="Times New Roman" w:cs="Times New Roman" w:eastAsia="Times New Roman" w:hAnsi="Times New Roman"/>
           <w:b/>
           <w:bCs/>
-          <w:caps/>
           <w:sz w:val="21"/>
           <w:szCs w:val="21"/>
           <w:u w:val="single"/>
@@ -587,7 +605,7 @@
         <w:tabs>
           <w:tab w:val="right" w:pos="9026"/>
         </w:tabs>
-        <w:spacing w:after="0"/>
+        <w:spacing w:after="0" w:before="0"/>
       </w:pPr>
       <w:r>
         <w:rPr>
@@ -602,6 +620,8 @@
       <w:r>
         <w:rPr>
           <w:rFonts w:ascii="Times New Roman" w:cs="Times New Roman" w:eastAsia="Times New Roman" w:hAnsi="Times New Roman"/>
+          <w:b w:val="false"/>
+          <w:bCs w:val="false"/>
           <w:sz w:val="21"/>
           <w:szCs w:val="21"/>
         </w:rPr>
@@ -610,11 +630,13 @@
     </w:p>
     <w:p>
       <w:pPr>
-        <w:spacing w:after="40"/>
-      </w:pPr>
-      <w:r>
-        <w:rPr>
-          <w:rFonts w:ascii="Times New Roman" w:cs="Times New Roman" w:eastAsia="Times New Roman" w:hAnsi="Times New Roman"/>
+        <w:spacing w:after="40" w:before="0"/>
+      </w:pPr>
+      <w:r>
+        <w:rPr>
+          <w:rFonts w:ascii="Times New Roman" w:cs="Times New Roman" w:eastAsia="Times New Roman" w:hAnsi="Times New Roman"/>
+          <w:b w:val="false"/>
+          <w:bCs w:val="false"/>
           <w:sz w:val="21"/>
           <w:szCs w:val="21"/>
         </w:rPr>
@@ -623,12 +645,14 @@
     </w:p>
     <w:p>
       <w:pPr>
-        <w:spacing w:after="20"/>
-        <w:ind w:left="270" w:hanging="180"/>
-      </w:pPr>
-      <w:r>
-        <w:rPr>
-          <w:rFonts w:ascii="Times New Roman" w:cs="Times New Roman" w:eastAsia="Times New Roman" w:hAnsi="Times New Roman"/>
+        <w:spacing w:after="20" w:before="0"/>
+        <w:ind w:left="270"/>
+      </w:pPr>
+      <w:r>
+        <w:rPr>
+          <w:rFonts w:ascii="Times New Roman" w:cs="Times New Roman" w:eastAsia="Times New Roman" w:hAnsi="Times New Roman"/>
+          <w:b w:val="false"/>
+          <w:bCs w:val="false"/>
           <w:sz w:val="21"/>
           <w:szCs w:val="21"/>
         </w:rPr>
@@ -637,6 +661,8 @@
       <w:r>
         <w:rPr>
           <w:rFonts w:ascii="Times New Roman" w:cs="Times New Roman" w:eastAsia="Times New Roman" w:hAnsi="Times New Roman"/>
+          <w:b w:val="false"/>
+          <w:bCs w:val="false"/>
           <w:sz w:val="21"/>
           <w:szCs w:val="21"/>
         </w:rPr>
@@ -648,7 +674,7 @@
         <w:tabs>
           <w:tab w:val="right" w:pos="9026"/>
         </w:tabs>
-        <w:spacing w:after="0"/>
+        <w:spacing w:after="0" w:before="0"/>
       </w:pPr>
       <w:r>
         <w:rPr>
@@ -663,6 +689,8 @@
       <w:r>
         <w:rPr>
           <w:rFonts w:ascii="Times New Roman" w:cs="Times New Roman" w:eastAsia="Times New Roman" w:hAnsi="Times New Roman"/>
+          <w:b w:val="false"/>
+          <w:bCs w:val="false"/>
           <w:sz w:val="21"/>
           <w:szCs w:val="21"/>
         </w:rPr>
@@ -671,11 +699,13 @@
     </w:p>
     <w:p>
       <w:pPr>
-        <w:spacing w:after="40"/>
-      </w:pPr>
-      <w:r>
-        <w:rPr>
-          <w:rFonts w:ascii="Times New Roman" w:cs="Times New Roman" w:eastAsia="Times New Roman" w:hAnsi="Times New Roman"/>
+        <w:spacing w:after="40" w:before="0"/>
+      </w:pPr>
+      <w:r>
+        <w:rPr>
+          <w:rFonts w:ascii="Times New Roman" w:cs="Times New Roman" w:eastAsia="Times New Roman" w:hAnsi="Times New Roman"/>
+          <w:b w:val="false"/>
+          <w:bCs w:val="false"/>
           <w:sz w:val="21"/>
           <w:szCs w:val="21"/>
         </w:rPr>
@@ -684,12 +714,14 @@
     </w:p>
     <w:p>
       <w:pPr>
-        <w:spacing w:after="20"/>
-        <w:ind w:left="270" w:hanging="180"/>
-      </w:pPr>
-      <w:r>
-        <w:rPr>
-          <w:rFonts w:ascii="Times New Roman" w:cs="Times New Roman" w:eastAsia="Times New Roman" w:hAnsi="Times New Roman"/>
+        <w:spacing w:after="20" w:before="0"/>
+        <w:ind w:left="270"/>
+      </w:pPr>
+      <w:r>
+        <w:rPr>
+          <w:rFonts w:ascii="Times New Roman" w:cs="Times New Roman" w:eastAsia="Times New Roman" w:hAnsi="Times New Roman"/>
+          <w:b w:val="false"/>
+          <w:bCs w:val="false"/>
           <w:sz w:val="21"/>
           <w:szCs w:val="21"/>
         </w:rPr>
@@ -698,6 +730,8 @@
       <w:r>
         <w:rPr>
           <w:rFonts w:ascii="Times New Roman" w:cs="Times New Roman" w:eastAsia="Times New Roman" w:hAnsi="Times New Roman"/>
+          <w:b w:val="false"/>
+          <w:bCs w:val="false"/>
           <w:sz w:val="21"/>
           <w:szCs w:val="21"/>
         </w:rPr>
@@ -706,9 +740,6 @@
     </w:p>
     <w:p>
       <w:pPr>
-        <w:pBdr>
-          <w:bottom w:val="none"/>
-        </w:pBdr>
         <w:spacing w:after="60" w:before="180"/>
       </w:pPr>
       <w:r>
@@ -716,7 +747,6 @@
           <w:rFonts w:ascii="Times New Roman" w:cs="Times New Roman" w:eastAsia="Times New Roman" w:hAnsi="Times New Roman"/>
           <w:b/>
           <w:bCs/>
-          <w:caps/>
           <w:sz w:val="21"/>
           <w:szCs w:val="21"/>
           <w:u w:val="single"/>
@@ -726,12 +756,14 @@
     </w:p>
     <w:p>
       <w:pPr>
-        <w:spacing w:after="20"/>
-        <w:ind w:left="270" w:hanging="180"/>
-      </w:pPr>
-      <w:r>
-        <w:rPr>
-          <w:rFonts w:ascii="Times New Roman" w:cs="Times New Roman" w:eastAsia="Times New Roman" w:hAnsi="Times New Roman"/>
+        <w:spacing w:after="20" w:before="0"/>
+        <w:ind w:left="270"/>
+      </w:pPr>
+      <w:r>
+        <w:rPr>
+          <w:rFonts w:ascii="Times New Roman" w:cs="Times New Roman" w:eastAsia="Times New Roman" w:hAnsi="Times New Roman"/>
+          <w:b w:val="false"/>
+          <w:bCs w:val="false"/>
           <w:sz w:val="21"/>
           <w:szCs w:val="21"/>
         </w:rPr>
@@ -740,6 +772,8 @@
       <w:r>
         <w:rPr>
           <w:rFonts w:ascii="Times New Roman" w:cs="Times New Roman" w:eastAsia="Times New Roman" w:hAnsi="Times New Roman"/>
+          <w:b w:val="false"/>
+          <w:bCs w:val="false"/>
           <w:sz w:val="21"/>
           <w:szCs w:val="21"/>
         </w:rPr>
@@ -748,12 +782,14 @@
     </w:p>
     <w:p>
       <w:pPr>
-        <w:spacing w:after="20"/>
-        <w:ind w:left="270" w:hanging="180"/>
-      </w:pPr>
-      <w:r>
-        <w:rPr>
-          <w:rFonts w:ascii="Times New Roman" w:cs="Times New Roman" w:eastAsia="Times New Roman" w:hAnsi="Times New Roman"/>
+        <w:spacing w:after="20" w:before="0"/>
+        <w:ind w:left="270"/>
+      </w:pPr>
+      <w:r>
+        <w:rPr>
+          <w:rFonts w:ascii="Times New Roman" w:cs="Times New Roman" w:eastAsia="Times New Roman" w:hAnsi="Times New Roman"/>
+          <w:b w:val="false"/>
+          <w:bCs w:val="false"/>
           <w:sz w:val="21"/>
           <w:szCs w:val="21"/>
         </w:rPr>
@@ -762,6 +798,8 @@
       <w:r>
         <w:rPr>
           <w:rFonts w:ascii="Times New Roman" w:cs="Times New Roman" w:eastAsia="Times New Roman" w:hAnsi="Times New Roman"/>
+          <w:b w:val="false"/>
+          <w:bCs w:val="false"/>
           <w:sz w:val="21"/>
           <w:szCs w:val="21"/>
         </w:rPr>
@@ -770,12 +808,14 @@
     </w:p>
     <w:p>
       <w:pPr>
-        <w:spacing w:after="20"/>
-        <w:ind w:left="270" w:hanging="180"/>
-      </w:pPr>
-      <w:r>
-        <w:rPr>
-          <w:rFonts w:ascii="Times New Roman" w:cs="Times New Roman" w:eastAsia="Times New Roman" w:hAnsi="Times New Roman"/>
+        <w:spacing w:after="20" w:before="0"/>
+        <w:ind w:left="270"/>
+      </w:pPr>
+      <w:r>
+        <w:rPr>
+          <w:rFonts w:ascii="Times New Roman" w:cs="Times New Roman" w:eastAsia="Times New Roman" w:hAnsi="Times New Roman"/>
+          <w:b w:val="false"/>
+          <w:bCs w:val="false"/>
           <w:sz w:val="21"/>
           <w:szCs w:val="21"/>
         </w:rPr>
@@ -784,6 +824,8 @@
       <w:r>
         <w:rPr>
           <w:rFonts w:ascii="Times New Roman" w:cs="Times New Roman" w:eastAsia="Times New Roman" w:hAnsi="Times New Roman"/>
+          <w:b w:val="false"/>
+          <w:bCs w:val="false"/>
           <w:sz w:val="21"/>
           <w:szCs w:val="21"/>
         </w:rPr>

</xml_diff>

<commit_message>
Weekly internship search: 2026-10-17 (reconciliation checkpoint)
Co-Authored-By: Claude Sonnet 5 <noreply@anthropic.com>
Claude-Session: https://claude.ai/code/session_01AEjiapuS5ShbSSqPGjKtvg
</commit_message>
<xml_diff>
--- a/resumes/database.docx
+++ b/resumes/database.docx
@@ -4,7 +4,7 @@
   <w:body>
     <w:p>
       <w:pPr>
-        <w:spacing w:after="40" w:before="0"/>
+        <w:spacing w:after="40"/>
         <w:jc w:val="center"/>
       </w:pPr>
       <w:r>
@@ -23,14 +23,12 @@
         <w:pBdr>
           <w:bottom w:val="single" w:color="000000" w:sz="6" w:space="6"/>
         </w:pBdr>
-        <w:spacing w:after="100" w:before="0"/>
+        <w:spacing w:after="100"/>
         <w:jc w:val="center"/>
       </w:pPr>
       <w:r>
         <w:rPr>
           <w:rFonts w:ascii="Times New Roman" w:cs="Times New Roman" w:eastAsia="Times New Roman" w:hAnsi="Times New Roman"/>
-          <w:b w:val="false"/>
-          <w:bCs w:val="false"/>
           <w:sz w:val="18"/>
           <w:szCs w:val="18"/>
         </w:rPr>
@@ -39,6 +37,9 @@
     </w:p>
     <w:p>
       <w:pPr>
+        <w:pBdr>
+          <w:bottom w:val="none"/>
+        </w:pBdr>
         <w:spacing w:after="60" w:before="180"/>
       </w:pPr>
       <w:r>
@@ -46,6 +47,7 @@
           <w:rFonts w:ascii="Times New Roman" w:cs="Times New Roman" w:eastAsia="Times New Roman" w:hAnsi="Times New Roman"/>
           <w:b/>
           <w:bCs/>
+          <w:caps/>
           <w:sz w:val="21"/>
           <w:szCs w:val="21"/>
           <w:u w:val="single"/>
@@ -55,7 +57,7 @@
     </w:p>
     <w:p>
       <w:pPr>
-        <w:spacing w:after="20" w:before="0"/>
+        <w:spacing w:after="20"/>
       </w:pPr>
       <w:r>
         <w:rPr>
@@ -70,8 +72,6 @@
       <w:r>
         <w:rPr>
           <w:rFonts w:ascii="Times New Roman" w:cs="Times New Roman" w:eastAsia="Times New Roman" w:hAnsi="Times New Roman"/>
-          <w:b w:val="false"/>
-          <w:bCs w:val="false"/>
           <w:sz w:val="21"/>
           <w:szCs w:val="21"/>
         </w:rPr>
@@ -90,14 +90,12 @@
     </w:p>
     <w:p>
       <w:pPr>
-        <w:spacing w:after="20" w:before="0"/>
-        <w:ind w:left="270"/>
-      </w:pPr>
-      <w:r>
-        <w:rPr>
-          <w:rFonts w:ascii="Times New Roman" w:cs="Times New Roman" w:eastAsia="Times New Roman" w:hAnsi="Times New Roman"/>
-          <w:b w:val="false"/>
-          <w:bCs w:val="false"/>
+        <w:spacing w:after="20"/>
+        <w:ind w:left="270" w:hanging="180"/>
+      </w:pPr>
+      <w:r>
+        <w:rPr>
+          <w:rFonts w:ascii="Times New Roman" w:cs="Times New Roman" w:eastAsia="Times New Roman" w:hAnsi="Times New Roman"/>
           <w:sz w:val="21"/>
           <w:szCs w:val="21"/>
         </w:rPr>
@@ -106,24 +104,30 @@
       <w:r>
         <w:rPr>
           <w:rFonts w:ascii="Times New Roman" w:cs="Times New Roman" w:eastAsia="Times New Roman" w:hAnsi="Times New Roman"/>
-          <w:b w:val="false"/>
-          <w:bCs w:val="false"/>
-          <w:sz w:val="21"/>
-          <w:szCs w:val="21"/>
-        </w:rPr>
-        <w:t xml:space="preserve">GPA: 3.578</w:t>
-      </w:r>
-    </w:p>
-    <w:p>
-      <w:pPr>
-        <w:spacing w:after="20" w:before="0"/>
-        <w:ind w:left="270"/>
-      </w:pPr>
-      <w:r>
-        <w:rPr>
-          <w:rFonts w:ascii="Times New Roman" w:cs="Times New Roman" w:eastAsia="Times New Roman" w:hAnsi="Times New Roman"/>
-          <w:b w:val="false"/>
-          <w:bCs w:val="false"/>
+          <w:b/>
+          <w:bCs/>
+          <w:sz w:val="21"/>
+          <w:szCs w:val="21"/>
+        </w:rPr>
+        <w:t xml:space="preserve">GPA: </w:t>
+      </w:r>
+      <w:r>
+        <w:rPr>
+          <w:rFonts w:ascii="Times New Roman" w:cs="Times New Roman" w:eastAsia="Times New Roman" w:hAnsi="Times New Roman"/>
+          <w:sz w:val="21"/>
+          <w:szCs w:val="21"/>
+        </w:rPr>
+        <w:t xml:space="preserve">3.578</w:t>
+      </w:r>
+    </w:p>
+    <w:p>
+      <w:pPr>
+        <w:spacing w:after="20"/>
+        <w:ind w:left="270" w:hanging="180"/>
+      </w:pPr>
+      <w:r>
+        <w:rPr>
+          <w:rFonts w:ascii="Times New Roman" w:cs="Times New Roman" w:eastAsia="Times New Roman" w:hAnsi="Times New Roman"/>
           <w:sz w:val="21"/>
           <w:szCs w:val="21"/>
         </w:rPr>
@@ -132,16 +136,27 @@
       <w:r>
         <w:rPr>
           <w:rFonts w:ascii="Times New Roman" w:cs="Times New Roman" w:eastAsia="Times New Roman" w:hAnsi="Times New Roman"/>
-          <w:b w:val="false"/>
-          <w:bCs w:val="false"/>
-          <w:sz w:val="21"/>
-          <w:szCs w:val="21"/>
-        </w:rPr>
-        <w:t xml:space="preserve">Relevant Coursework: Design and Analysis of Database Systems, Computer Algorithms, Software Development: Full Stack</w:t>
-      </w:r>
-    </w:p>
-    <w:p>
-      <w:pPr>
+          <w:b/>
+          <w:bCs/>
+          <w:sz w:val="21"/>
+          <w:szCs w:val="21"/>
+        </w:rPr>
+        <w:t xml:space="preserve">Relevant Coursework: </w:t>
+      </w:r>
+      <w:r>
+        <w:rPr>
+          <w:rFonts w:ascii="Times New Roman" w:cs="Times New Roman" w:eastAsia="Times New Roman" w:hAnsi="Times New Roman"/>
+          <w:sz w:val="21"/>
+          <w:szCs w:val="21"/>
+        </w:rPr>
+        <w:t xml:space="preserve">Design and Analysis of Database Systems, Computer Algorithms, Software Development: Full Stack</w:t>
+      </w:r>
+    </w:p>
+    <w:p>
+      <w:pPr>
+        <w:pBdr>
+          <w:bottom w:val="none"/>
+        </w:pBdr>
         <w:spacing w:after="60" w:before="180"/>
       </w:pPr>
       <w:r>
@@ -149,6 +164,7 @@
           <w:rFonts w:ascii="Times New Roman" w:cs="Times New Roman" w:eastAsia="Times New Roman" w:hAnsi="Times New Roman"/>
           <w:b/>
           <w:bCs/>
+          <w:caps/>
           <w:sz w:val="21"/>
           <w:szCs w:val="21"/>
           <w:u w:val="single"/>
@@ -158,81 +174,78 @@
     </w:p>
     <w:p>
       <w:pPr>
-        <w:spacing w:after="40" w:before="0"/>
-      </w:pPr>
-      <w:r>
-        <w:rPr>
-          <w:rFonts w:ascii="Times New Roman" w:cs="Times New Roman" w:eastAsia="Times New Roman" w:hAnsi="Times New Roman"/>
-          <w:b/>
-          <w:bCs/>
-          <w:sz w:val="21"/>
-          <w:szCs w:val="21"/>
-        </w:rPr>
-        <w:t xml:space="preserve">Languages:</w:t>
-      </w:r>
-      <w:r>
-        <w:rPr>
-          <w:rFonts w:ascii="Times New Roman" w:cs="Times New Roman" w:eastAsia="Times New Roman" w:hAnsi="Times New Roman"/>
-          <w:b w:val="false"/>
-          <w:bCs w:val="false"/>
-          <w:sz w:val="21"/>
-          <w:szCs w:val="21"/>
-        </w:rPr>
-        <w:t xml:space="preserve"> SQL, Python, R-Studio, C++, JavaScript, Node.js, C, HTML, Arduino</w:t>
-      </w:r>
-    </w:p>
-    <w:p>
-      <w:pPr>
-        <w:spacing w:after="40" w:before="0"/>
-      </w:pPr>
-      <w:r>
-        <w:rPr>
-          <w:rFonts w:ascii="Times New Roman" w:cs="Times New Roman" w:eastAsia="Times New Roman" w:hAnsi="Times New Roman"/>
-          <w:b/>
-          <w:bCs/>
-          <w:sz w:val="21"/>
-          <w:szCs w:val="21"/>
-        </w:rPr>
-        <w:t xml:space="preserve">Tools:</w:t>
-      </w:r>
-      <w:r>
-        <w:rPr>
-          <w:rFonts w:ascii="Times New Roman" w:cs="Times New Roman" w:eastAsia="Times New Roman" w:hAnsi="Times New Roman"/>
-          <w:b w:val="false"/>
-          <w:bCs w:val="false"/>
-          <w:sz w:val="21"/>
-          <w:szCs w:val="21"/>
-        </w:rPr>
-        <w:t xml:space="preserve"> Microsoft Excel, Postman, Docker, Azure DevOps, Salesforce, MacOS, Windows OS, Google Suite</w:t>
-      </w:r>
-    </w:p>
-    <w:p>
-      <w:pPr>
-        <w:spacing w:after="40" w:before="0"/>
-      </w:pPr>
-      <w:r>
-        <w:rPr>
-          <w:rFonts w:ascii="Times New Roman" w:cs="Times New Roman" w:eastAsia="Times New Roman" w:hAnsi="Times New Roman"/>
-          <w:b/>
-          <w:bCs/>
-          <w:sz w:val="21"/>
-          <w:szCs w:val="21"/>
-        </w:rPr>
-        <w:t xml:space="preserve">Other:</w:t>
-      </w:r>
-      <w:r>
-        <w:rPr>
-          <w:rFonts w:ascii="Times New Roman" w:cs="Times New Roman" w:eastAsia="Times New Roman" w:hAnsi="Times New Roman"/>
-          <w:b w:val="false"/>
-          <w:bCs w:val="false"/>
-          <w:sz w:val="21"/>
-          <w:szCs w:val="21"/>
-        </w:rPr>
-        <w:t xml:space="preserve"> Data Analysis, Statistical Analysis, Analytical Problem Solving, AI Prompt Engineering</w:t>
-      </w:r>
-    </w:p>
-    <w:p>
-      <w:pPr>
+        <w:spacing w:after="20"/>
+      </w:pPr>
+      <w:r>
+        <w:rPr>
+          <w:rFonts w:ascii="Times New Roman" w:cs="Times New Roman" w:eastAsia="Times New Roman" w:hAnsi="Times New Roman"/>
+          <w:b/>
+          <w:bCs/>
+          <w:sz w:val="21"/>
+          <w:szCs w:val="21"/>
+        </w:rPr>
+        <w:t xml:space="preserve">Languages: </w:t>
+      </w:r>
+      <w:r>
+        <w:rPr>
+          <w:rFonts w:ascii="Times New Roman" w:cs="Times New Roman" w:eastAsia="Times New Roman" w:hAnsi="Times New Roman"/>
+          <w:sz w:val="21"/>
+          <w:szCs w:val="21"/>
+        </w:rPr>
+        <w:t xml:space="preserve">SQL, Python, R-Studio, C++, JavaScript, Node.js, C, HTML, Arduino</w:t>
+      </w:r>
+    </w:p>
+    <w:p>
+      <w:pPr>
+        <w:spacing w:after="20"/>
+      </w:pPr>
+      <w:r>
+        <w:rPr>
+          <w:rFonts w:ascii="Times New Roman" w:cs="Times New Roman" w:eastAsia="Times New Roman" w:hAnsi="Times New Roman"/>
+          <w:b/>
+          <w:bCs/>
+          <w:sz w:val="21"/>
+          <w:szCs w:val="21"/>
+        </w:rPr>
+        <w:t xml:space="preserve">Tools: </w:t>
+      </w:r>
+      <w:r>
+        <w:rPr>
+          <w:rFonts w:ascii="Times New Roman" w:cs="Times New Roman" w:eastAsia="Times New Roman" w:hAnsi="Times New Roman"/>
+          <w:sz w:val="21"/>
+          <w:szCs w:val="21"/>
+        </w:rPr>
+        <w:t xml:space="preserve">Microsoft Excel, Postman, Docker, Azure DevOps, Salesforce, MacOS, Windows OS, Google Suite</w:t>
+      </w:r>
+    </w:p>
+    <w:p>
+      <w:pPr>
+        <w:spacing w:after="20"/>
+      </w:pPr>
+      <w:r>
+        <w:rPr>
+          <w:rFonts w:ascii="Times New Roman" w:cs="Times New Roman" w:eastAsia="Times New Roman" w:hAnsi="Times New Roman"/>
+          <w:b/>
+          <w:bCs/>
+          <w:sz w:val="21"/>
+          <w:szCs w:val="21"/>
+        </w:rPr>
+        <w:t xml:space="preserve">Other Skills: </w:t>
+      </w:r>
+      <w:r>
+        <w:rPr>
+          <w:rFonts w:ascii="Times New Roman" w:cs="Times New Roman" w:eastAsia="Times New Roman" w:hAnsi="Times New Roman"/>
+          <w:sz w:val="21"/>
+          <w:szCs w:val="21"/>
+        </w:rPr>
+        <w:t xml:space="preserve">Data Analysis, Statistical Analysis, Analytical Problem Solving, AI Prompt Engineering</w:t>
+      </w:r>
+    </w:p>
+    <w:p>
+      <w:pPr>
+        <w:pBdr>
+          <w:bottom w:val="none"/>
+        </w:pBdr>
         <w:spacing w:after="60" w:before="180"/>
       </w:pPr>
       <w:r>
@@ -240,6 +253,7 @@
           <w:rFonts w:ascii="Times New Roman" w:cs="Times New Roman" w:eastAsia="Times New Roman" w:hAnsi="Times New Roman"/>
           <w:b/>
           <w:bCs/>
+          <w:caps/>
           <w:sz w:val="21"/>
           <w:szCs w:val="21"/>
           <w:u w:val="single"/>
@@ -249,7 +263,7 @@
     </w:p>
     <w:p>
       <w:pPr>
-        <w:spacing w:after="60" w:before="0"/>
+        <w:spacing w:after="60"/>
       </w:pPr>
       <w:r>
         <w:rPr>
@@ -264,8 +278,6 @@
       <w:r>
         <w:rPr>
           <w:rFonts w:ascii="Times New Roman" w:cs="Times New Roman" w:eastAsia="Times New Roman" w:hAnsi="Times New Roman"/>
-          <w:b w:val="false"/>
-          <w:bCs w:val="false"/>
           <w:sz w:val="21"/>
           <w:szCs w:val="21"/>
         </w:rPr>
@@ -274,8 +286,6 @@
       <w:r>
         <w:rPr>
           <w:rFonts w:ascii="Times New Roman" w:cs="Times New Roman" w:eastAsia="Times New Roman" w:hAnsi="Times New Roman"/>
-          <w:b w:val="false"/>
-          <w:bCs w:val="false"/>
           <w:sz w:val="21"/>
           <w:szCs w:val="21"/>
         </w:rPr>
@@ -284,7 +294,7 @@
     </w:p>
     <w:p>
       <w:pPr>
-        <w:spacing w:after="60" w:before="0"/>
+        <w:spacing w:after="60"/>
       </w:pPr>
       <w:r>
         <w:rPr>
@@ -299,8 +309,6 @@
       <w:r>
         <w:rPr>
           <w:rFonts w:ascii="Times New Roman" w:cs="Times New Roman" w:eastAsia="Times New Roman" w:hAnsi="Times New Roman"/>
-          <w:b w:val="false"/>
-          <w:bCs w:val="false"/>
           <w:sz w:val="21"/>
           <w:szCs w:val="21"/>
         </w:rPr>
@@ -309,8 +317,6 @@
       <w:r>
         <w:rPr>
           <w:rFonts w:ascii="Times New Roman" w:cs="Times New Roman" w:eastAsia="Times New Roman" w:hAnsi="Times New Roman"/>
-          <w:b w:val="false"/>
-          <w:bCs w:val="false"/>
           <w:sz w:val="21"/>
           <w:szCs w:val="21"/>
         </w:rPr>
@@ -319,7 +325,7 @@
     </w:p>
     <w:p>
       <w:pPr>
-        <w:spacing w:after="60" w:before="0"/>
+        <w:spacing w:after="60"/>
       </w:pPr>
       <w:r>
         <w:rPr>
@@ -334,8 +340,6 @@
       <w:r>
         <w:rPr>
           <w:rFonts w:ascii="Times New Roman" w:cs="Times New Roman" w:eastAsia="Times New Roman" w:hAnsi="Times New Roman"/>
-          <w:b w:val="false"/>
-          <w:bCs w:val="false"/>
           <w:sz w:val="21"/>
           <w:szCs w:val="21"/>
         </w:rPr>
@@ -344,8 +348,6 @@
       <w:r>
         <w:rPr>
           <w:rFonts w:ascii="Times New Roman" w:cs="Times New Roman" w:eastAsia="Times New Roman" w:hAnsi="Times New Roman"/>
-          <w:b w:val="false"/>
-          <w:bCs w:val="false"/>
           <w:sz w:val="21"/>
           <w:szCs w:val="21"/>
         </w:rPr>
@@ -354,6 +356,9 @@
     </w:p>
     <w:p>
       <w:pPr>
+        <w:pBdr>
+          <w:bottom w:val="none"/>
+        </w:pBdr>
         <w:spacing w:after="60" w:before="180"/>
       </w:pPr>
       <w:r>
@@ -361,6 +366,7 @@
           <w:rFonts w:ascii="Times New Roman" w:cs="Times New Roman" w:eastAsia="Times New Roman" w:hAnsi="Times New Roman"/>
           <w:b/>
           <w:bCs/>
+          <w:caps/>
           <w:sz w:val="21"/>
           <w:szCs w:val="21"/>
           <w:u w:val="single"/>
@@ -373,7 +379,7 @@
         <w:tabs>
           <w:tab w:val="right" w:pos="9026"/>
         </w:tabs>
-        <w:spacing w:after="0" w:before="0"/>
+        <w:spacing w:after="0"/>
       </w:pPr>
       <w:r>
         <w:rPr>
@@ -388,8 +394,6 @@
       <w:r>
         <w:rPr>
           <w:rFonts w:ascii="Times New Roman" w:cs="Times New Roman" w:eastAsia="Times New Roman" w:hAnsi="Times New Roman"/>
-          <w:b w:val="false"/>
-          <w:bCs w:val="false"/>
           <w:sz w:val="21"/>
           <w:szCs w:val="21"/>
         </w:rPr>
@@ -398,13 +402,11 @@
     </w:p>
     <w:p>
       <w:pPr>
-        <w:spacing w:after="40" w:before="0"/>
-      </w:pPr>
-      <w:r>
-        <w:rPr>
-          <w:rFonts w:ascii="Times New Roman" w:cs="Times New Roman" w:eastAsia="Times New Roman" w:hAnsi="Times New Roman"/>
-          <w:b w:val="false"/>
-          <w:bCs w:val="false"/>
+        <w:spacing w:after="40"/>
+      </w:pPr>
+      <w:r>
+        <w:rPr>
+          <w:rFonts w:ascii="Times New Roman" w:cs="Times New Roman" w:eastAsia="Times New Roman" w:hAnsi="Times New Roman"/>
           <w:sz w:val="21"/>
           <w:szCs w:val="21"/>
         </w:rPr>
@@ -413,14 +415,12 @@
     </w:p>
     <w:p>
       <w:pPr>
-        <w:spacing w:after="20" w:before="0"/>
-        <w:ind w:left="270"/>
-      </w:pPr>
-      <w:r>
-        <w:rPr>
-          <w:rFonts w:ascii="Times New Roman" w:cs="Times New Roman" w:eastAsia="Times New Roman" w:hAnsi="Times New Roman"/>
-          <w:b w:val="false"/>
-          <w:bCs w:val="false"/>
+        <w:spacing w:after="20"/>
+        <w:ind w:left="270" w:hanging="180"/>
+      </w:pPr>
+      <w:r>
+        <w:rPr>
+          <w:rFonts w:ascii="Times New Roman" w:cs="Times New Roman" w:eastAsia="Times New Roman" w:hAnsi="Times New Roman"/>
           <w:sz w:val="21"/>
           <w:szCs w:val="21"/>
         </w:rPr>
@@ -429,8 +429,6 @@
       <w:r>
         <w:rPr>
           <w:rFonts w:ascii="Times New Roman" w:cs="Times New Roman" w:eastAsia="Times New Roman" w:hAnsi="Times New Roman"/>
-          <w:b w:val="false"/>
-          <w:bCs w:val="false"/>
           <w:sz w:val="21"/>
           <w:szCs w:val="21"/>
         </w:rPr>
@@ -439,14 +437,12 @@
     </w:p>
     <w:p>
       <w:pPr>
-        <w:spacing w:after="20" w:before="0"/>
-        <w:ind w:left="270"/>
-      </w:pPr>
-      <w:r>
-        <w:rPr>
-          <w:rFonts w:ascii="Times New Roman" w:cs="Times New Roman" w:eastAsia="Times New Roman" w:hAnsi="Times New Roman"/>
-          <w:b w:val="false"/>
-          <w:bCs w:val="false"/>
+        <w:spacing w:after="20"/>
+        <w:ind w:left="270" w:hanging="180"/>
+      </w:pPr>
+      <w:r>
+        <w:rPr>
+          <w:rFonts w:ascii="Times New Roman" w:cs="Times New Roman" w:eastAsia="Times New Roman" w:hAnsi="Times New Roman"/>
           <w:sz w:val="21"/>
           <w:szCs w:val="21"/>
         </w:rPr>
@@ -455,8 +451,6 @@
       <w:r>
         <w:rPr>
           <w:rFonts w:ascii="Times New Roman" w:cs="Times New Roman" w:eastAsia="Times New Roman" w:hAnsi="Times New Roman"/>
-          <w:b w:val="false"/>
-          <w:bCs w:val="false"/>
           <w:sz w:val="21"/>
           <w:szCs w:val="21"/>
         </w:rPr>
@@ -465,14 +459,12 @@
     </w:p>
     <w:p>
       <w:pPr>
-        <w:spacing w:after="20" w:before="0"/>
-        <w:ind w:left="270"/>
-      </w:pPr>
-      <w:r>
-        <w:rPr>
-          <w:rFonts w:ascii="Times New Roman" w:cs="Times New Roman" w:eastAsia="Times New Roman" w:hAnsi="Times New Roman"/>
-          <w:b w:val="false"/>
-          <w:bCs w:val="false"/>
+        <w:spacing w:after="20"/>
+        <w:ind w:left="270" w:hanging="180"/>
+      </w:pPr>
+      <w:r>
+        <w:rPr>
+          <w:rFonts w:ascii="Times New Roman" w:cs="Times New Roman" w:eastAsia="Times New Roman" w:hAnsi="Times New Roman"/>
           <w:sz w:val="21"/>
           <w:szCs w:val="21"/>
         </w:rPr>
@@ -481,8 +473,6 @@
       <w:r>
         <w:rPr>
           <w:rFonts w:ascii="Times New Roman" w:cs="Times New Roman" w:eastAsia="Times New Roman" w:hAnsi="Times New Roman"/>
-          <w:b w:val="false"/>
-          <w:bCs w:val="false"/>
           <w:sz w:val="21"/>
           <w:szCs w:val="21"/>
         </w:rPr>
@@ -494,7 +484,7 @@
         <w:tabs>
           <w:tab w:val="right" w:pos="9026"/>
         </w:tabs>
-        <w:spacing w:after="0" w:before="0"/>
+        <w:spacing w:after="0"/>
       </w:pPr>
       <w:r>
         <w:rPr>
@@ -509,8 +499,6 @@
       <w:r>
         <w:rPr>
           <w:rFonts w:ascii="Times New Roman" w:cs="Times New Roman" w:eastAsia="Times New Roman" w:hAnsi="Times New Roman"/>
-          <w:b w:val="false"/>
-          <w:bCs w:val="false"/>
           <w:sz w:val="21"/>
           <w:szCs w:val="21"/>
         </w:rPr>
@@ -519,13 +507,11 @@
     </w:p>
     <w:p>
       <w:pPr>
-        <w:spacing w:after="40" w:before="0"/>
-      </w:pPr>
-      <w:r>
-        <w:rPr>
-          <w:rFonts w:ascii="Times New Roman" w:cs="Times New Roman" w:eastAsia="Times New Roman" w:hAnsi="Times New Roman"/>
-          <w:b w:val="false"/>
-          <w:bCs w:val="false"/>
+        <w:spacing w:after="40"/>
+      </w:pPr>
+      <w:r>
+        <w:rPr>
+          <w:rFonts w:ascii="Times New Roman" w:cs="Times New Roman" w:eastAsia="Times New Roman" w:hAnsi="Times New Roman"/>
           <w:sz w:val="21"/>
           <w:szCs w:val="21"/>
         </w:rPr>
@@ -534,14 +520,12 @@
     </w:p>
     <w:p>
       <w:pPr>
-        <w:spacing w:after="20" w:before="0"/>
-        <w:ind w:left="270"/>
-      </w:pPr>
-      <w:r>
-        <w:rPr>
-          <w:rFonts w:ascii="Times New Roman" w:cs="Times New Roman" w:eastAsia="Times New Roman" w:hAnsi="Times New Roman"/>
-          <w:b w:val="false"/>
-          <w:bCs w:val="false"/>
+        <w:spacing w:after="20"/>
+        <w:ind w:left="270" w:hanging="180"/>
+      </w:pPr>
+      <w:r>
+        <w:rPr>
+          <w:rFonts w:ascii="Times New Roman" w:cs="Times New Roman" w:eastAsia="Times New Roman" w:hAnsi="Times New Roman"/>
           <w:sz w:val="21"/>
           <w:szCs w:val="21"/>
         </w:rPr>
@@ -550,8 +534,6 @@
       <w:r>
         <w:rPr>
           <w:rFonts w:ascii="Times New Roman" w:cs="Times New Roman" w:eastAsia="Times New Roman" w:hAnsi="Times New Roman"/>
-          <w:b w:val="false"/>
-          <w:bCs w:val="false"/>
           <w:sz w:val="21"/>
           <w:szCs w:val="21"/>
         </w:rPr>
@@ -560,14 +542,12 @@
     </w:p>
     <w:p>
       <w:pPr>
-        <w:spacing w:after="20" w:before="0"/>
-        <w:ind w:left="270"/>
-      </w:pPr>
-      <w:r>
-        <w:rPr>
-          <w:rFonts w:ascii="Times New Roman" w:cs="Times New Roman" w:eastAsia="Times New Roman" w:hAnsi="Times New Roman"/>
-          <w:b w:val="false"/>
-          <w:bCs w:val="false"/>
+        <w:spacing w:after="20"/>
+        <w:ind w:left="270" w:hanging="180"/>
+      </w:pPr>
+      <w:r>
+        <w:rPr>
+          <w:rFonts w:ascii="Times New Roman" w:cs="Times New Roman" w:eastAsia="Times New Roman" w:hAnsi="Times New Roman"/>
           <w:sz w:val="21"/>
           <w:szCs w:val="21"/>
         </w:rPr>
@@ -576,8 +556,6 @@
       <w:r>
         <w:rPr>
           <w:rFonts w:ascii="Times New Roman" w:cs="Times New Roman" w:eastAsia="Times New Roman" w:hAnsi="Times New Roman"/>
-          <w:b w:val="false"/>
-          <w:bCs w:val="false"/>
           <w:sz w:val="21"/>
           <w:szCs w:val="21"/>
         </w:rPr>
@@ -586,6 +564,9 @@
     </w:p>
     <w:p>
       <w:pPr>
+        <w:pBdr>
+          <w:bottom w:val="none"/>
+        </w:pBdr>
         <w:spacing w:after="60" w:before="180"/>
       </w:pPr>
       <w:r>
@@ -593,6 +574,7 @@
           <w:rFonts w:ascii="Times New Roman" w:cs="Times New Roman" w:eastAsia="Times New Roman" w:hAnsi="Times New Roman"/>
           <w:b/>
           <w:bCs/>
+          <w:caps/>
           <w:sz w:val="21"/>
           <w:szCs w:val="21"/>
           <w:u w:val="single"/>
@@ -605,7 +587,7 @@
         <w:tabs>
           <w:tab w:val="right" w:pos="9026"/>
         </w:tabs>
-        <w:spacing w:after="0" w:before="0"/>
+        <w:spacing w:after="0"/>
       </w:pPr>
       <w:r>
         <w:rPr>
@@ -620,8 +602,6 @@
       <w:r>
         <w:rPr>
           <w:rFonts w:ascii="Times New Roman" w:cs="Times New Roman" w:eastAsia="Times New Roman" w:hAnsi="Times New Roman"/>
-          <w:b w:val="false"/>
-          <w:bCs w:val="false"/>
           <w:sz w:val="21"/>
           <w:szCs w:val="21"/>
         </w:rPr>
@@ -630,13 +610,11 @@
     </w:p>
     <w:p>
       <w:pPr>
-        <w:spacing w:after="40" w:before="0"/>
-      </w:pPr>
-      <w:r>
-        <w:rPr>
-          <w:rFonts w:ascii="Times New Roman" w:cs="Times New Roman" w:eastAsia="Times New Roman" w:hAnsi="Times New Roman"/>
-          <w:b w:val="false"/>
-          <w:bCs w:val="false"/>
+        <w:spacing w:after="40"/>
+      </w:pPr>
+      <w:r>
+        <w:rPr>
+          <w:rFonts w:ascii="Times New Roman" w:cs="Times New Roman" w:eastAsia="Times New Roman" w:hAnsi="Times New Roman"/>
           <w:sz w:val="21"/>
           <w:szCs w:val="21"/>
         </w:rPr>
@@ -645,14 +623,12 @@
     </w:p>
     <w:p>
       <w:pPr>
-        <w:spacing w:after="20" w:before="0"/>
-        <w:ind w:left="270"/>
-      </w:pPr>
-      <w:r>
-        <w:rPr>
-          <w:rFonts w:ascii="Times New Roman" w:cs="Times New Roman" w:eastAsia="Times New Roman" w:hAnsi="Times New Roman"/>
-          <w:b w:val="false"/>
-          <w:bCs w:val="false"/>
+        <w:spacing w:after="20"/>
+        <w:ind w:left="270" w:hanging="180"/>
+      </w:pPr>
+      <w:r>
+        <w:rPr>
+          <w:rFonts w:ascii="Times New Roman" w:cs="Times New Roman" w:eastAsia="Times New Roman" w:hAnsi="Times New Roman"/>
           <w:sz w:val="21"/>
           <w:szCs w:val="21"/>
         </w:rPr>
@@ -661,8 +637,6 @@
       <w:r>
         <w:rPr>
           <w:rFonts w:ascii="Times New Roman" w:cs="Times New Roman" w:eastAsia="Times New Roman" w:hAnsi="Times New Roman"/>
-          <w:b w:val="false"/>
-          <w:bCs w:val="false"/>
           <w:sz w:val="21"/>
           <w:szCs w:val="21"/>
         </w:rPr>
@@ -674,7 +648,7 @@
         <w:tabs>
           <w:tab w:val="right" w:pos="9026"/>
         </w:tabs>
-        <w:spacing w:after="0" w:before="0"/>
+        <w:spacing w:after="0"/>
       </w:pPr>
       <w:r>
         <w:rPr>
@@ -689,8 +663,6 @@
       <w:r>
         <w:rPr>
           <w:rFonts w:ascii="Times New Roman" w:cs="Times New Roman" w:eastAsia="Times New Roman" w:hAnsi="Times New Roman"/>
-          <w:b w:val="false"/>
-          <w:bCs w:val="false"/>
           <w:sz w:val="21"/>
           <w:szCs w:val="21"/>
         </w:rPr>
@@ -699,13 +671,11 @@
     </w:p>
     <w:p>
       <w:pPr>
-        <w:spacing w:after="40" w:before="0"/>
-      </w:pPr>
-      <w:r>
-        <w:rPr>
-          <w:rFonts w:ascii="Times New Roman" w:cs="Times New Roman" w:eastAsia="Times New Roman" w:hAnsi="Times New Roman"/>
-          <w:b w:val="false"/>
-          <w:bCs w:val="false"/>
+        <w:spacing w:after="40"/>
+      </w:pPr>
+      <w:r>
+        <w:rPr>
+          <w:rFonts w:ascii="Times New Roman" w:cs="Times New Roman" w:eastAsia="Times New Roman" w:hAnsi="Times New Roman"/>
           <w:sz w:val="21"/>
           <w:szCs w:val="21"/>
         </w:rPr>
@@ -714,14 +684,12 @@
     </w:p>
     <w:p>
       <w:pPr>
-        <w:spacing w:after="20" w:before="0"/>
-        <w:ind w:left="270"/>
-      </w:pPr>
-      <w:r>
-        <w:rPr>
-          <w:rFonts w:ascii="Times New Roman" w:cs="Times New Roman" w:eastAsia="Times New Roman" w:hAnsi="Times New Roman"/>
-          <w:b w:val="false"/>
-          <w:bCs w:val="false"/>
+        <w:spacing w:after="20"/>
+        <w:ind w:left="270" w:hanging="180"/>
+      </w:pPr>
+      <w:r>
+        <w:rPr>
+          <w:rFonts w:ascii="Times New Roman" w:cs="Times New Roman" w:eastAsia="Times New Roman" w:hAnsi="Times New Roman"/>
           <w:sz w:val="21"/>
           <w:szCs w:val="21"/>
         </w:rPr>
@@ -730,8 +698,6 @@
       <w:r>
         <w:rPr>
           <w:rFonts w:ascii="Times New Roman" w:cs="Times New Roman" w:eastAsia="Times New Roman" w:hAnsi="Times New Roman"/>
-          <w:b w:val="false"/>
-          <w:bCs w:val="false"/>
           <w:sz w:val="21"/>
           <w:szCs w:val="21"/>
         </w:rPr>
@@ -740,6 +706,9 @@
     </w:p>
     <w:p>
       <w:pPr>
+        <w:pBdr>
+          <w:bottom w:val="none"/>
+        </w:pBdr>
         <w:spacing w:after="60" w:before="180"/>
       </w:pPr>
       <w:r>
@@ -747,6 +716,7 @@
           <w:rFonts w:ascii="Times New Roman" w:cs="Times New Roman" w:eastAsia="Times New Roman" w:hAnsi="Times New Roman"/>
           <w:b/>
           <w:bCs/>
+          <w:caps/>
           <w:sz w:val="21"/>
           <w:szCs w:val="21"/>
           <w:u w:val="single"/>
@@ -756,14 +726,12 @@
     </w:p>
     <w:p>
       <w:pPr>
-        <w:spacing w:after="20" w:before="0"/>
-        <w:ind w:left="270"/>
-      </w:pPr>
-      <w:r>
-        <w:rPr>
-          <w:rFonts w:ascii="Times New Roman" w:cs="Times New Roman" w:eastAsia="Times New Roman" w:hAnsi="Times New Roman"/>
-          <w:b w:val="false"/>
-          <w:bCs w:val="false"/>
+        <w:spacing w:after="20"/>
+        <w:ind w:left="270" w:hanging="180"/>
+      </w:pPr>
+      <w:r>
+        <w:rPr>
+          <w:rFonts w:ascii="Times New Roman" w:cs="Times New Roman" w:eastAsia="Times New Roman" w:hAnsi="Times New Roman"/>
           <w:sz w:val="21"/>
           <w:szCs w:val="21"/>
         </w:rPr>
@@ -772,8 +740,6 @@
       <w:r>
         <w:rPr>
           <w:rFonts w:ascii="Times New Roman" w:cs="Times New Roman" w:eastAsia="Times New Roman" w:hAnsi="Times New Roman"/>
-          <w:b w:val="false"/>
-          <w:bCs w:val="false"/>
           <w:sz w:val="21"/>
           <w:szCs w:val="21"/>
         </w:rPr>
@@ -782,14 +748,12 @@
     </w:p>
     <w:p>
       <w:pPr>
-        <w:spacing w:after="20" w:before="0"/>
-        <w:ind w:left="270"/>
-      </w:pPr>
-      <w:r>
-        <w:rPr>
-          <w:rFonts w:ascii="Times New Roman" w:cs="Times New Roman" w:eastAsia="Times New Roman" w:hAnsi="Times New Roman"/>
-          <w:b w:val="false"/>
-          <w:bCs w:val="false"/>
+        <w:spacing w:after="20"/>
+        <w:ind w:left="270" w:hanging="180"/>
+      </w:pPr>
+      <w:r>
+        <w:rPr>
+          <w:rFonts w:ascii="Times New Roman" w:cs="Times New Roman" w:eastAsia="Times New Roman" w:hAnsi="Times New Roman"/>
           <w:sz w:val="21"/>
           <w:szCs w:val="21"/>
         </w:rPr>
@@ -798,8 +762,6 @@
       <w:r>
         <w:rPr>
           <w:rFonts w:ascii="Times New Roman" w:cs="Times New Roman" w:eastAsia="Times New Roman" w:hAnsi="Times New Roman"/>
-          <w:b w:val="false"/>
-          <w:bCs w:val="false"/>
           <w:sz w:val="21"/>
           <w:szCs w:val="21"/>
         </w:rPr>
@@ -808,14 +770,12 @@
     </w:p>
     <w:p>
       <w:pPr>
-        <w:spacing w:after="20" w:before="0"/>
-        <w:ind w:left="270"/>
-      </w:pPr>
-      <w:r>
-        <w:rPr>
-          <w:rFonts w:ascii="Times New Roman" w:cs="Times New Roman" w:eastAsia="Times New Roman" w:hAnsi="Times New Roman"/>
-          <w:b w:val="false"/>
-          <w:bCs w:val="false"/>
+        <w:spacing w:after="20"/>
+        <w:ind w:left="270" w:hanging="180"/>
+      </w:pPr>
+      <w:r>
+        <w:rPr>
+          <w:rFonts w:ascii="Times New Roman" w:cs="Times New Roman" w:eastAsia="Times New Roman" w:hAnsi="Times New Roman"/>
           <w:sz w:val="21"/>
           <w:szCs w:val="21"/>
         </w:rPr>
@@ -824,8 +784,6 @@
       <w:r>
         <w:rPr>
           <w:rFonts w:ascii="Times New Roman" w:cs="Times New Roman" w:eastAsia="Times New Roman" w:hAnsi="Times New Roman"/>
-          <w:b w:val="false"/>
-          <w:bCs w:val="false"/>
           <w:sz w:val="21"/>
           <w:szCs w:val="21"/>
         </w:rPr>

</xml_diff>